<commit_message>
Finalize MegaBall design intent
</commit_message>
<xml_diff>
--- a/docs/MEGABALL_DESIGN_INTENT.docx
+++ b/docs/MEGABALL_DESIGN_INTENT.docx
@@ -6,7 +6,7 @@
       <w:pPr>
         <w:pStyle w:val="Title"/>
         <w:keepNext/>
-        <w:spacing w:after="300"/>
+        <w:spacing w:after="280"/>
         <w:jc w:val="left"/>
       </w:pPr>
       <w:r>
@@ -23,7 +23,7 @@
       <w:pPr>
         <w:pStyle w:val="Heading1"/>
         <w:keepNext/>
-        <w:spacing w:before="160" w:after="60"/>
+        <w:spacing w:before="140" w:after="60"/>
       </w:pPr>
       <w:r>
         <w:rPr>
@@ -46,14 +46,14 @@
           <w:color w:val="000000"/>
           <w:sz w:val="21"/>
         </w:rPr>
-        <w:t>MEGABALL - Tower Defense and Strategy</w:t>
+        <w:t>MegaBall Defense - Tower Defense and Strategy</w:t>
       </w:r>
     </w:p>
     <w:p>
       <w:pPr>
         <w:pStyle w:val="Heading1"/>
         <w:keepNext/>
-        <w:spacing w:before="160" w:after="60"/>
+        <w:spacing w:before="140" w:after="60"/>
       </w:pPr>
       <w:r>
         <w:rPr>
@@ -76,14 +76,28 @@
           <w:color w:val="000000"/>
           <w:sz w:val="21"/>
         </w:rPr>
-        <w:t>MEGABALL is for players who enjoy fast, touch-first arcade action but also want meaningful placement and upgrade decisions. It is a portrait tower-defense game played on a pinball table: enemy balls descend toward a drain while the player builds automatic defenses and saves shots with manual flippers. A session offers readable pressure, quick tactical choices, and the satisfaction of redirecting danger back into the swarm.</w:t>
+        <w:t>MegaBall Defense is for players who enjoy strategy, tower defense, resource management, pinball, and fast-paced action.</w:t>
+      </w:r>
+    </w:p>
+    <w:p>
+      <w:pPr>
+        <w:widowControl/>
+      </w:pPr>
+      <w:r>
+        <w:rPr>
+          <w:rFonts w:ascii="Arial" w:hAnsi="Arial"/>
+          <w:b w:val="0"/>
+          <w:color w:val="000000"/>
+          <w:sz w:val="21"/>
+        </w:rPr>
+        <w:t>It is a tower-defense game with pinball as its twist: players position defenses to redirect rapidly falling enemy balls, make them collide, and stop them reaching the drain. Energy management, cards, and power-ups help players turn difficult waves in their favour.</w:t>
       </w:r>
     </w:p>
     <w:p>
       <w:pPr>
         <w:pStyle w:val="Heading1"/>
         <w:keepNext/>
-        <w:spacing w:before="160" w:after="60"/>
+        <w:spacing w:before="140" w:after="60"/>
       </w:pPr>
       <w:r>
         <w:rPr>
@@ -106,14 +120,56 @@
           <w:color w:val="000000"/>
           <w:sz w:val="21"/>
         </w:rPr>
-        <w:t>Tap START, select World 1, choose a level, then tap PLAY LEVEL. Tap PADDLE or BUMPER and then an open build slot. Tap a placed defense to upgrade or sell it. Hold the left or right half of the playfield to operate the matching flipper; hold both for both. Tap cards to use active powers, and tap START during build phases to launch the next wave.</w:t>
+        <w:t>Select Play and choose a level. The opening tutorial explains the controls.</w:t>
+      </w:r>
+    </w:p>
+    <w:p>
+      <w:pPr>
+        <w:widowControl/>
+      </w:pPr>
+      <w:r>
+        <w:rPr>
+          <w:rFonts w:ascii="Arial" w:hAnsi="Arial"/>
+          <w:b w:val="0"/>
+          <w:color w:val="000000"/>
+          <w:sz w:val="21"/>
+        </w:rPr>
+        <w:t>Hold either half of the playfield to operate the matching bottom flipper and knock balls away from the drain. These manual flippers do not deal damage.</w:t>
+      </w:r>
+    </w:p>
+    <w:p>
+      <w:pPr>
+        <w:widowControl/>
+      </w:pPr>
+      <w:r>
+        <w:rPr>
+          <w:rFonts w:ascii="Arial" w:hAnsi="Arial"/>
+          <w:b w:val="0"/>
+          <w:color w:val="000000"/>
+          <w:sz w:val="21"/>
+        </w:rPr>
+        <w:t>Spend Energy on automatic Paddles or Bumpers using the build controls beside the cards, then place them in open slots. These defenses damage and redirect balls automatically and can be upgraded between waves.</w:t>
+      </w:r>
+    </w:p>
+    <w:p>
+      <w:pPr>
+        <w:widowControl/>
+      </w:pPr>
+      <w:r>
+        <w:rPr>
+          <w:rFonts w:ascii="Arial" w:hAnsi="Arial"/>
+          <w:b w:val="0"/>
+          <w:color w:val="000000"/>
+          <w:sz w:val="21"/>
+        </w:rPr>
+        <w:t>Tap a card to use its power.</w:t>
       </w:r>
     </w:p>
     <w:p>
       <w:pPr>
         <w:pStyle w:val="Heading1"/>
         <w:keepNext/>
-        <w:spacing w:before="160" w:after="60"/>
+        <w:spacing w:before="140" w:after="60"/>
       </w:pPr>
       <w:r>
         <w:rPr>
@@ -136,14 +192,42 @@
           <w:color w:val="000000"/>
           <w:sz w:val="21"/>
         </w:rPr>
-        <w:t>Spend Energy to place or upgrade defenses, start a wave, and use flippers and cards to prevent enemy balls from reaching the drain. Destroyed enemies generate Energy for the next decision. Lives, Energy, wave progress, hit effects, and status rings show how the run is going. Clearing every wave wins; losing all five lives ends the level; the results screen supports replay or progression. The loop is satisfying because every bounce can rescue a leak, trigger a defense, or create a damaging chain reaction.</w:t>
+        <w:t>Enemy balls fall towards the drain in increasingly difficult waves. Place Paddles and Bumpers to damage and redirect them, using the manual flippers to save escaping balls.</w:t>
+      </w:r>
+    </w:p>
+    <w:p>
+      <w:pPr>
+        <w:widowControl/>
+      </w:pPr>
+      <w:r>
+        <w:rPr>
+          <w:rFonts w:ascii="Arial" w:hAnsi="Arial"/>
+          <w:b w:val="0"/>
+          <w:color w:val="000000"/>
+          <w:sz w:val="21"/>
+        </w:rPr>
+        <w:t>Destroyed enemies provide Energy for new defenses, upgrades, and repairs. Enemies become stronger and can damage defenses, so the player must improve and repair the board to keep up.</w:t>
+      </w:r>
+    </w:p>
+    <w:p>
+      <w:pPr>
+        <w:widowControl/>
+      </w:pPr>
+      <w:r>
+        <w:rPr>
+          <w:rFonts w:ascii="Arial" w:hAnsi="Arial"/>
+          <w:b w:val="0"/>
+          <w:color w:val="000000"/>
+          <w:sz w:val="21"/>
+        </w:rPr>
+        <w:t>Clear every ball to win; let too many reach the drain and the level ends.</w:t>
       </w:r>
     </w:p>
     <w:p>
       <w:pPr>
         <w:pStyle w:val="Heading1"/>
         <w:keepNext/>
-        <w:spacing w:before="160" w:after="60"/>
+        <w:spacing w:before="140" w:after="60"/>
       </w:pPr>
       <w:r>
         <w:rPr>
@@ -166,14 +250,42 @@
           <w:color w:val="000000"/>
           <w:sz w:val="21"/>
         </w:rPr>
-        <w:t>The submitted build contains five playable levels; scripted waves; seven enemy types including bosses; automatic paddles and bumpers with branching upgrades; an Energy economy; four equipped card slots plus level-specific powers; manual flippers; a guided tutorial; pause, results, win, lose, replay, and reset flows; and star-based card and slot unlocks. It runs in fixed portrait orientation from a self-contained offline HTML5 package. There is no multiplayer. Progress beyond these five levels, additional worlds, online services, and persistent competitive features are not included.</w:t>
+        <w:t>The prototype contains five playable levels with distinct boards, waves, challenges, and bosses. It includes several enemy types, automatic Paddles and Bumpers with branching upgrades, power-up cards, an Energy economy, and complete win and loss states.</w:t>
+      </w:r>
+    </w:p>
+    <w:p>
+      <w:pPr>
+        <w:widowControl/>
+      </w:pPr>
+      <w:r>
+        <w:rPr>
+          <w:rFonts w:ascii="Arial" w:hAnsi="Arial"/>
+          <w:b w:val="0"/>
+          <w:color w:val="000000"/>
+          <w:sz w:val="21"/>
+        </w:rPr>
+        <w:t>An interactive tutorial, level selection, card loadout, star ratings, unlockable cards and slots, pause, restart, and Endless Mode are included. Endless Mode creates increasingly difficult waves and records the player's best run.</w:t>
+      </w:r>
+    </w:p>
+    <w:p>
+      <w:pPr>
+        <w:widowControl/>
+      </w:pPr>
+      <w:r>
+        <w:rPr>
+          <w:rFonts w:ascii="Arial" w:hAnsi="Arial"/>
+          <w:b w:val="0"/>
+          <w:color w:val="000000"/>
+          <w:sz w:val="21"/>
+        </w:rPr>
+        <w:t>The current build covers one world. Additional worlds are not included.</w:t>
       </w:r>
     </w:p>
     <w:p>
       <w:pPr>
         <w:pStyle w:val="Heading1"/>
         <w:keepNext/>
-        <w:spacing w:before="160" w:after="60"/>
+        <w:spacing w:before="140" w:after="60"/>
       </w:pPr>
       <w:r>
         <w:rPr>
@@ -196,14 +308,42 @@
           <w:color w:val="000000"/>
           <w:sz w:val="21"/>
         </w:rPr>
-        <w:t>Within one sitting, waves become denser, enemy types gain distinct behaviours, bosses appear, and the player's board grows from a few basic defenses into a specialised machine. Stars unlock cards and card slots across the five-level path. The signature twist is the Megaball: a Power Paddle or card converts an enemy ball into a temporary friendly projectile that smashes through other enemies, rewarding placement and timing with chain destruction.</w:t>
+        <w:t>The signature twist is the crossover between pinball and tower defense. Players use physics to redirect enemy balls while building defenses that control each wave.</w:t>
+      </w:r>
+    </w:p>
+    <w:p>
+      <w:pPr>
+        <w:widowControl/>
+      </w:pPr>
+      <w:r>
+        <w:rPr>
+          <w:rFonts w:ascii="Arial" w:hAnsi="Arial"/>
+          <w:b w:val="0"/>
+          <w:color w:val="000000"/>
+          <w:sz w:val="21"/>
+        </w:rPr>
+        <w:t>One of my favourite mechanics is the Mega Ball. The Power Paddle and Mega Ball card turn an enemy ball into a weapon that destroys other balls on contact, creating chain reactions with satisfying visual and sound feedback.</w:t>
+      </w:r>
+    </w:p>
+    <w:p>
+      <w:pPr>
+        <w:widowControl/>
+      </w:pPr>
+      <w:r>
+        <w:rPr>
+          <w:rFonts w:ascii="Arial" w:hAnsi="Arial"/>
+          <w:b w:val="0"/>
+          <w:color w:val="000000"/>
+          <w:sz w:val="21"/>
+        </w:rPr>
+        <w:t>Waves become faster and tougher as new enemies and bosses appear and the player's board grows stronger.</w:t>
       </w:r>
     </w:p>
     <w:p>
       <w:pPr>
         <w:pStyle w:val="Heading1"/>
         <w:keepNext/>
-        <w:spacing w:before="160" w:after="60"/>
+        <w:spacing w:before="140" w:after="60"/>
       </w:pPr>
       <w:r>
         <w:rPr>
@@ -226,12 +366,87 @@
           <w:color w:val="000000"/>
           <w:sz w:val="21"/>
         </w:rPr>
-        <w:t>A full version would expand the prototype into multiple themed worlds with more board layouts, enemies, bosses, defenses, cards, objectives, and a longer progression path. The central experience would remain a portrait pinball tower-defense game built around reshaping the board and turning incoming threats into weapons.</w:t>
+        <w:t>The full version would add:</w:t>
+      </w:r>
+    </w:p>
+    <w:p>
+      <w:pPr>
+        <w:pStyle w:val="ListBullet"/>
+        <w:widowControl/>
+      </w:pPr>
+      <w:r>
+        <w:rPr>
+          <w:rFonts w:ascii="Arial" w:hAnsi="Arial"/>
+          <w:b w:val="0"/>
+          <w:color w:val="000000"/>
+          <w:sz w:val="20"/>
+        </w:rPr>
+        <w:t>A larger playfield with additional player-controlled side paddles.</w:t>
+      </w:r>
+    </w:p>
+    <w:p>
+      <w:pPr>
+        <w:pStyle w:val="ListBullet"/>
+        <w:widowControl/>
+      </w:pPr>
+      <w:r>
+        <w:rPr>
+          <w:rFonts w:ascii="Arial" w:hAnsi="Arial"/>
+          <w:b w:val="0"/>
+          <w:color w:val="000000"/>
+          <w:sz w:val="20"/>
+        </w:rPr>
+        <w:t>Tiered Freeze I, II, and III, Power Paddle I, II, and III, and Mega Ball I, II, and III upgrades.</w:t>
+      </w:r>
+    </w:p>
+    <w:p>
+      <w:pPr>
+        <w:pStyle w:val="ListBullet"/>
+        <w:widowControl/>
+      </w:pPr>
+      <w:r>
+        <w:rPr>
+          <w:rFonts w:ascii="Arial" w:hAnsi="Arial"/>
+          <w:b w:val="0"/>
+          <w:color w:val="000000"/>
+          <w:sz w:val="20"/>
+        </w:rPr>
+        <w:t>Merging two Level I Bumpers into a tougher Level II Bumper while repairing damage, with later Level III merges.</w:t>
+      </w:r>
+    </w:p>
+    <w:p>
+      <w:pPr>
+        <w:pStyle w:val="ListBullet"/>
+        <w:widowControl/>
+      </w:pPr>
+      <w:r>
+        <w:rPr>
+          <w:rFonts w:ascii="Arial" w:hAnsi="Arial"/>
+          <w:b w:val="0"/>
+          <w:color w:val="000000"/>
+          <w:sz w:val="20"/>
+        </w:rPr>
+        <w:t>Defense fusions, more worlds, world-specific cards and boosters, and bosses with different weaknesses.</w:t>
+      </w:r>
+    </w:p>
+    <w:p>
+      <w:pPr>
+        <w:pStyle w:val="ListBullet"/>
+        <w:widowControl/>
+      </w:pPr>
+      <w:r>
+        <w:rPr>
+          <w:rFonts w:ascii="Arial" w:hAnsi="Arial"/>
+          <w:b w:val="0"/>
+          <w:color w:val="000000"/>
+          <w:sz w:val="20"/>
+        </w:rPr>
+        <w:t>Haptics, more sound effects, stronger impact feedback, random wave events, random card choices, and deeper Endless Mode progression.</w:t>
       </w:r>
     </w:p>
     <w:sectPr>
       <w:pgSz w:w="12240" w:h="15840"/>
-      <w:pgMar w:top="1123" w:right="1325" w:bottom="1066" w:left="1325" w:header="720" w:footer="720" w:gutter="0"/>
+      <w:pgMar w:top="1037" w:right="1296" w:bottom="1037" w:left="1296" w:header="720" w:footer="720" w:gutter="0"/>
       <w:cols w:space="720"/>
       <w:docGrid w:linePitch="360"/>
     </w:sectPr>
@@ -603,8 +818,7 @@
     <w:qFormat/>
     <w:rsid w:val="00FC693F"/>
     <w:pPr>
-      <w:keepLines/>
-      <w:spacing w:after="90" w:line="259" w:lineRule="auto"/>
+      <w:spacing w:after="100" w:line="254" w:lineRule="auto"/>
     </w:pPr>
     <w:rPr>
       <w:rFonts w:ascii="Arial" w:hAnsi="Arial"/>
@@ -1137,8 +1351,16 @@
       <w:numPr>
         <w:numId w:val="1"/>
       </w:numPr>
+      <w:spacing w:after="60" w:line="245" w:lineRule="auto"/>
+      <w:ind w:left="317" w:hanging="202"/>
       <w:contextualSpacing/>
     </w:pPr>
+    <w:rPr>
+      <w:rFonts w:ascii="Arial" w:hAnsi="Arial"/>
+      <w:b w:val="0"/>
+      <w:color w:val="000000"/>
+      <w:sz w:val="20"/>
+    </w:rPr>
   </w:style>
   <w:style w:type="paragraph" w:styleId="ListBullet2">
     <w:name w:val="List Bullet 2"/>

</xml_diff>

<commit_message>
Improve design intent readability
</commit_message>
<xml_diff>
--- a/docs/MEGABALL_DESIGN_INTENT.docx
+++ b/docs/MEGABALL_DESIGN_INTENT.docx
@@ -6,7 +6,7 @@
       <w:pPr>
         <w:pStyle w:val="Title"/>
         <w:keepNext/>
-        <w:spacing w:after="280"/>
+        <w:spacing w:after="320"/>
         <w:jc w:val="left"/>
       </w:pPr>
       <w:r>
@@ -23,20 +23,22 @@
       <w:pPr>
         <w:pStyle w:val="Heading1"/>
         <w:keepNext/>
-        <w:spacing w:before="140" w:after="60"/>
+        <w:pageBreakBefore w:val="0"/>
+        <w:spacing w:before="180" w:after="80"/>
       </w:pPr>
       <w:r>
         <w:rPr>
           <w:rFonts w:ascii="Arial" w:hAnsi="Arial"/>
           <w:b/>
           <w:color w:val="000000"/>
-          <w:sz w:val="29"/>
+          <w:sz w:val="30"/>
         </w:rPr>
         <w:t>1. Game title and genre</w:t>
       </w:r>
     </w:p>
     <w:p>
       <w:pPr>
+        <w:keepLines/>
         <w:widowControl/>
       </w:pPr>
       <w:r>
@@ -44,7 +46,7 @@
           <w:rFonts w:ascii="Arial" w:hAnsi="Arial"/>
           <w:b w:val="0"/>
           <w:color w:val="000000"/>
-          <w:sz w:val="21"/>
+          <w:sz w:val="22"/>
         </w:rPr>
         <w:t>MegaBall Defense - Tower Defense and Strategy</w:t>
       </w:r>
@@ -53,20 +55,22 @@
       <w:pPr>
         <w:pStyle w:val="Heading1"/>
         <w:keepNext/>
-        <w:spacing w:before="140" w:after="60"/>
+        <w:pageBreakBefore w:val="0"/>
+        <w:spacing w:before="180" w:after="80"/>
       </w:pPr>
       <w:r>
         <w:rPr>
           <w:rFonts w:ascii="Arial" w:hAnsi="Arial"/>
           <w:b/>
           <w:color w:val="000000"/>
-          <w:sz w:val="29"/>
+          <w:sz w:val="30"/>
         </w:rPr>
         <w:t>2. Target player and pitch</w:t>
       </w:r>
     </w:p>
     <w:p>
       <w:pPr>
+        <w:keepLines/>
         <w:widowControl/>
       </w:pPr>
       <w:r>
@@ -74,13 +78,14 @@
           <w:rFonts w:ascii="Arial" w:hAnsi="Arial"/>
           <w:b w:val="0"/>
           <w:color w:val="000000"/>
-          <w:sz w:val="21"/>
+          <w:sz w:val="22"/>
         </w:rPr>
         <w:t>MegaBall Defense is for players who enjoy strategy, tower defense, resource management, pinball, and fast-paced action.</w:t>
       </w:r>
     </w:p>
     <w:p>
       <w:pPr>
+        <w:keepLines/>
         <w:widowControl/>
       </w:pPr>
       <w:r>
@@ -88,7 +93,7 @@
           <w:rFonts w:ascii="Arial" w:hAnsi="Arial"/>
           <w:b w:val="0"/>
           <w:color w:val="000000"/>
-          <w:sz w:val="21"/>
+          <w:sz w:val="22"/>
         </w:rPr>
         <w:t>It is a tower-defense game with pinball as its twist: players position defenses to redirect rapidly falling enemy balls, make them collide, and stop them reaching the drain. Energy management, cards, and power-ups help players turn difficult waves in their favour.</w:t>
       </w:r>
@@ -97,20 +102,23 @@
       <w:pPr>
         <w:pStyle w:val="Heading1"/>
         <w:keepNext/>
-        <w:spacing w:before="140" w:after="60"/>
+        <w:pageBreakBefore w:val="0"/>
+        <w:spacing w:before="180" w:after="80"/>
       </w:pPr>
       <w:r>
         <w:rPr>
           <w:rFonts w:ascii="Arial" w:hAnsi="Arial"/>
           <w:b/>
           <w:color w:val="000000"/>
-          <w:sz w:val="29"/>
+          <w:sz w:val="30"/>
         </w:rPr>
         <w:t>3. How to play (controls)</w:t>
       </w:r>
     </w:p>
     <w:p>
       <w:pPr>
+        <w:pStyle w:val="ListBullet"/>
+        <w:keepLines/>
         <w:widowControl/>
       </w:pPr>
       <w:r>
@@ -125,6 +133,8 @@
     </w:p>
     <w:p>
       <w:pPr>
+        <w:pStyle w:val="ListBullet"/>
+        <w:keepLines/>
         <w:widowControl/>
       </w:pPr>
       <w:r>
@@ -139,6 +149,8 @@
     </w:p>
     <w:p>
       <w:pPr>
+        <w:pStyle w:val="ListBullet"/>
+        <w:keepLines/>
         <w:widowControl/>
       </w:pPr>
       <w:r>
@@ -153,6 +165,8 @@
     </w:p>
     <w:p>
       <w:pPr>
+        <w:pStyle w:val="ListBullet"/>
+        <w:keepLines/>
         <w:widowControl/>
       </w:pPr>
       <w:r>
@@ -169,20 +183,22 @@
       <w:pPr>
         <w:pStyle w:val="Heading1"/>
         <w:keepNext/>
-        <w:spacing w:before="140" w:after="60"/>
+        <w:pageBreakBefore w:val="0"/>
+        <w:spacing w:before="180" w:after="80"/>
       </w:pPr>
       <w:r>
         <w:rPr>
           <w:rFonts w:ascii="Arial" w:hAnsi="Arial"/>
           <w:b/>
           <w:color w:val="000000"/>
-          <w:sz w:val="29"/>
+          <w:sz w:val="30"/>
         </w:rPr>
         <w:t>4. Core loop</w:t>
       </w:r>
     </w:p>
     <w:p>
       <w:pPr>
+        <w:keepLines/>
         <w:widowControl/>
       </w:pPr>
       <w:r>
@@ -190,13 +206,14 @@
           <w:rFonts w:ascii="Arial" w:hAnsi="Arial"/>
           <w:b w:val="0"/>
           <w:color w:val="000000"/>
-          <w:sz w:val="21"/>
+          <w:sz w:val="22"/>
         </w:rPr>
         <w:t>Enemy balls fall towards the drain in increasingly difficult waves. Place Paddles and Bumpers to damage and redirect them, using the manual flippers to save escaping balls.</w:t>
       </w:r>
     </w:p>
     <w:p>
       <w:pPr>
+        <w:keepLines/>
         <w:widowControl/>
       </w:pPr>
       <w:r>
@@ -204,13 +221,14 @@
           <w:rFonts w:ascii="Arial" w:hAnsi="Arial"/>
           <w:b w:val="0"/>
           <w:color w:val="000000"/>
-          <w:sz w:val="21"/>
+          <w:sz w:val="22"/>
         </w:rPr>
         <w:t>Destroyed enemies provide Energy for new defenses, upgrades, and repairs. Enemies become stronger and can damage defenses, so the player must improve and repair the board to keep up.</w:t>
       </w:r>
     </w:p>
     <w:p>
       <w:pPr>
+        <w:keepLines/>
         <w:widowControl/>
       </w:pPr>
       <w:r>
@@ -218,7 +236,7 @@
           <w:rFonts w:ascii="Arial" w:hAnsi="Arial"/>
           <w:b w:val="0"/>
           <w:color w:val="000000"/>
-          <w:sz w:val="21"/>
+          <w:sz w:val="22"/>
         </w:rPr>
         <w:t>Clear every ball to win; let too many reach the drain and the level ends.</w:t>
       </w:r>
@@ -227,20 +245,23 @@
       <w:pPr>
         <w:pStyle w:val="Heading1"/>
         <w:keepNext/>
-        <w:spacing w:before="140" w:after="60"/>
+        <w:pageBreakBefore/>
+        <w:spacing w:before="180" w:after="80"/>
       </w:pPr>
       <w:r>
         <w:rPr>
           <w:rFonts w:ascii="Arial" w:hAnsi="Arial"/>
           <w:b/>
           <w:color w:val="000000"/>
-          <w:sz w:val="29"/>
+          <w:sz w:val="30"/>
         </w:rPr>
         <w:t>5. What is in this prototype</w:t>
       </w:r>
     </w:p>
     <w:p>
       <w:pPr>
+        <w:pStyle w:val="ListBullet"/>
+        <w:keepLines/>
         <w:widowControl/>
       </w:pPr>
       <w:r>
@@ -255,6 +276,8 @@
     </w:p>
     <w:p>
       <w:pPr>
+        <w:pStyle w:val="ListBullet"/>
+        <w:keepLines/>
         <w:widowControl/>
       </w:pPr>
       <w:r>
@@ -269,6 +292,8 @@
     </w:p>
     <w:p>
       <w:pPr>
+        <w:pStyle w:val="ListBullet"/>
+        <w:keepLines/>
         <w:widowControl/>
       </w:pPr>
       <w:r>
@@ -285,20 +310,100 @@
       <w:pPr>
         <w:pStyle w:val="Heading1"/>
         <w:keepNext/>
-        <w:spacing w:before="140" w:after="60"/>
+        <w:pageBreakBefore w:val="0"/>
+        <w:spacing w:before="180" w:after="80"/>
       </w:pPr>
       <w:r>
         <w:rPr>
           <w:rFonts w:ascii="Arial" w:hAnsi="Arial"/>
           <w:b/>
           <w:color w:val="000000"/>
-          <w:sz w:val="29"/>
+          <w:sz w:val="30"/>
         </w:rPr>
         <w:t>6. Progression and signature twist</w:t>
       </w:r>
     </w:p>
     <w:p>
       <w:pPr>
+        <w:keepLines/>
+        <w:widowControl/>
+      </w:pPr>
+      <w:r>
+        <w:rPr>
+          <w:rFonts w:ascii="Arial" w:hAnsi="Arial"/>
+          <w:b w:val="0"/>
+          <w:color w:val="000000"/>
+          <w:sz w:val="22"/>
+        </w:rPr>
+        <w:t>The signature twist is the crossover between pinball and tower defense. Players use physics to redirect enemy balls while building defenses that control each wave.</w:t>
+      </w:r>
+    </w:p>
+    <w:p>
+      <w:pPr>
+        <w:keepLines/>
+        <w:widowControl/>
+      </w:pPr>
+      <w:r>
+        <w:rPr>
+          <w:rFonts w:ascii="Arial" w:hAnsi="Arial"/>
+          <w:b w:val="0"/>
+          <w:color w:val="000000"/>
+          <w:sz w:val="22"/>
+        </w:rPr>
+        <w:t>One of my favourite mechanics is the Mega Ball. The Power Paddle and Mega Ball card turn an enemy ball into a weapon that destroys other balls on contact, creating chain reactions with satisfying visual and sound feedback.</w:t>
+      </w:r>
+    </w:p>
+    <w:p>
+      <w:pPr>
+        <w:keepLines/>
+        <w:widowControl/>
+      </w:pPr>
+      <w:r>
+        <w:rPr>
+          <w:rFonts w:ascii="Arial" w:hAnsi="Arial"/>
+          <w:b w:val="0"/>
+          <w:color w:val="000000"/>
+          <w:sz w:val="22"/>
+        </w:rPr>
+        <w:t>Waves become faster and tougher as new enemies and bosses appear and the player's board grows stronger.</w:t>
+      </w:r>
+    </w:p>
+    <w:p>
+      <w:pPr>
+        <w:pStyle w:val="Heading1"/>
+        <w:keepNext/>
+        <w:pageBreakBefore w:val="0"/>
+        <w:spacing w:before="180" w:after="80"/>
+      </w:pPr>
+      <w:r>
+        <w:rPr>
+          <w:rFonts w:ascii="Arial" w:hAnsi="Arial"/>
+          <w:b/>
+          <w:color w:val="000000"/>
+          <w:sz w:val="30"/>
+        </w:rPr>
+        <w:t>7. Future-state vision</w:t>
+      </w:r>
+    </w:p>
+    <w:p>
+      <w:pPr>
+        <w:keepLines/>
+        <w:widowControl/>
+      </w:pPr>
+      <w:r>
+        <w:rPr>
+          <w:rFonts w:ascii="Arial" w:hAnsi="Arial"/>
+          <w:b w:val="0"/>
+          <w:color w:val="000000"/>
+          <w:sz w:val="22"/>
+        </w:rPr>
+        <w:t>The full version would add:</w:t>
+      </w:r>
+    </w:p>
+    <w:p>
+      <w:pPr>
+        <w:pStyle w:val="ListBullet"/>
+        <w:keepLines/>
         <w:widowControl/>
       </w:pPr>
       <w:r>
@@ -308,11 +413,13 @@
           <w:color w:val="000000"/>
           <w:sz w:val="21"/>
         </w:rPr>
-        <w:t>The signature twist is the crossover between pinball and tower defense. Players use physics to redirect enemy balls while building defenses that control each wave.</w:t>
+        <w:t>A larger playfield with additional player-controlled side paddles.</w:t>
       </w:r>
     </w:p>
     <w:p>
       <w:pPr>
+        <w:pStyle w:val="ListBullet"/>
+        <w:keepLines/>
         <w:widowControl/>
       </w:pPr>
       <w:r>
@@ -322,11 +429,13 @@
           <w:color w:val="000000"/>
           <w:sz w:val="21"/>
         </w:rPr>
-        <w:t>One of my favourite mechanics is the Mega Ball. The Power Paddle and Mega Ball card turn an enemy ball into a weapon that destroys other balls on contact, creating chain reactions with satisfying visual and sound feedback.</w:t>
+        <w:t>Tiered Freeze I, II, and III, Power Paddle I, II, and III, and Mega Ball I, II, and III upgrades.</w:t>
       </w:r>
     </w:p>
     <w:p>
       <w:pPr>
+        <w:pStyle w:val="ListBullet"/>
+        <w:keepLines/>
         <w:widowControl/>
       </w:pPr>
       <w:r>
@@ -336,27 +445,13 @@
           <w:color w:val="000000"/>
           <w:sz w:val="21"/>
         </w:rPr>
-        <w:t>Waves become faster and tougher as new enemies and bosses appear and the player's board grows stronger.</w:t>
+        <w:t>Merging two Level I Bumpers into a tougher Level II Bumper while repairing damage, with later Level III merges.</w:t>
       </w:r>
     </w:p>
     <w:p>
       <w:pPr>
-        <w:pStyle w:val="Heading1"/>
-        <w:keepNext/>
-        <w:spacing w:before="140" w:after="60"/>
-      </w:pPr>
-      <w:r>
-        <w:rPr>
-          <w:rFonts w:ascii="Arial" w:hAnsi="Arial"/>
-          <w:b/>
-          <w:color w:val="000000"/>
-          <w:sz w:val="29"/>
-        </w:rPr>
-        <w:t>7. Future-state vision</w:t>
-      </w:r>
-    </w:p>
-    <w:p>
-      <w:pPr>
+        <w:pStyle w:val="ListBullet"/>
+        <w:keepLines/>
         <w:widowControl/>
       </w:pPr>
       <w:r>
@@ -366,12 +461,13 @@
           <w:color w:val="000000"/>
           <w:sz w:val="21"/>
         </w:rPr>
-        <w:t>The full version would add:</w:t>
+        <w:t>Defense fusions, more worlds, world-specific cards and boosters, and bosses with different weaknesses.</w:t>
       </w:r>
     </w:p>
     <w:p>
       <w:pPr>
         <w:pStyle w:val="ListBullet"/>
+        <w:keepLines/>
         <w:widowControl/>
       </w:pPr>
       <w:r>
@@ -379,74 +475,14 @@
           <w:rFonts w:ascii="Arial" w:hAnsi="Arial"/>
           <w:b w:val="0"/>
           <w:color w:val="000000"/>
-          <w:sz w:val="20"/>
-        </w:rPr>
-        <w:t>A larger playfield with additional player-controlled side paddles.</w:t>
-      </w:r>
-    </w:p>
-    <w:p>
-      <w:pPr>
-        <w:pStyle w:val="ListBullet"/>
-        <w:widowControl/>
-      </w:pPr>
-      <w:r>
-        <w:rPr>
-          <w:rFonts w:ascii="Arial" w:hAnsi="Arial"/>
-          <w:b w:val="0"/>
-          <w:color w:val="000000"/>
-          <w:sz w:val="20"/>
-        </w:rPr>
-        <w:t>Tiered Freeze I, II, and III, Power Paddle I, II, and III, and Mega Ball I, II, and III upgrades.</w:t>
-      </w:r>
-    </w:p>
-    <w:p>
-      <w:pPr>
-        <w:pStyle w:val="ListBullet"/>
-        <w:widowControl/>
-      </w:pPr>
-      <w:r>
-        <w:rPr>
-          <w:rFonts w:ascii="Arial" w:hAnsi="Arial"/>
-          <w:b w:val="0"/>
-          <w:color w:val="000000"/>
-          <w:sz w:val="20"/>
-        </w:rPr>
-        <w:t>Merging two Level I Bumpers into a tougher Level II Bumper while repairing damage, with later Level III merges.</w:t>
-      </w:r>
-    </w:p>
-    <w:p>
-      <w:pPr>
-        <w:pStyle w:val="ListBullet"/>
-        <w:widowControl/>
-      </w:pPr>
-      <w:r>
-        <w:rPr>
-          <w:rFonts w:ascii="Arial" w:hAnsi="Arial"/>
-          <w:b w:val="0"/>
-          <w:color w:val="000000"/>
-          <w:sz w:val="20"/>
-        </w:rPr>
-        <w:t>Defense fusions, more worlds, world-specific cards and boosters, and bosses with different weaknesses.</w:t>
-      </w:r>
-    </w:p>
-    <w:p>
-      <w:pPr>
-        <w:pStyle w:val="ListBullet"/>
-        <w:widowControl/>
-      </w:pPr>
-      <w:r>
-        <w:rPr>
-          <w:rFonts w:ascii="Arial" w:hAnsi="Arial"/>
-          <w:b w:val="0"/>
-          <w:color w:val="000000"/>
-          <w:sz w:val="20"/>
+          <w:sz w:val="21"/>
         </w:rPr>
         <w:t>Haptics, more sound effects, stronger impact feedback, random wave events, random card choices, and deeper Endless Mode progression.</w:t>
       </w:r>
     </w:p>
     <w:sectPr>
       <w:pgSz w:w="12240" w:h="15840"/>
-      <w:pgMar w:top="1037" w:right="1296" w:bottom="1037" w:left="1296" w:header="720" w:footer="720" w:gutter="0"/>
+      <w:pgMar w:top="1123" w:right="1368" w:bottom="1123" w:left="1368" w:header="720" w:footer="720" w:gutter="0"/>
       <w:cols w:space="720"/>
       <w:docGrid w:linePitch="360"/>
     </w:sectPr>
@@ -818,13 +854,13 @@
     <w:qFormat/>
     <w:rsid w:val="00FC693F"/>
     <w:pPr>
-      <w:spacing w:after="100" w:line="254" w:lineRule="auto"/>
+      <w:spacing w:after="120" w:line="259" w:lineRule="auto"/>
     </w:pPr>
     <w:rPr>
       <w:rFonts w:ascii="Arial" w:hAnsi="Arial"/>
       <w:b w:val="0"/>
       <w:color w:val="000000"/>
-      <w:sz w:val="21"/>
+      <w:sz w:val="22"/>
     </w:rPr>
   </w:style>
   <w:style w:type="paragraph" w:styleId="Header">
@@ -890,7 +926,7 @@
       <w:b/>
       <w:bCs/>
       <w:color w:val="000000"/>
-      <w:sz w:val="29"/>
+      <w:sz w:val="30"/>
       <w:szCs w:val="28"/>
     </w:rPr>
   </w:style>
@@ -1351,15 +1387,15 @@
       <w:numPr>
         <w:numId w:val="1"/>
       </w:numPr>
-      <w:spacing w:after="60" w:line="245" w:lineRule="auto"/>
-      <w:ind w:left="317" w:hanging="202"/>
+      <w:spacing w:after="80" w:line="254" w:lineRule="auto"/>
+      <w:ind w:left="403" w:hanging="230"/>
       <w:contextualSpacing/>
     </w:pPr>
     <w:rPr>
       <w:rFonts w:ascii="Arial" w:hAnsi="Arial"/>
       <w:b w:val="0"/>
       <w:color w:val="000000"/>
-      <w:sz w:val="20"/>
+      <w:sz w:val="21"/>
     </w:rPr>
   </w:style>
   <w:style w:type="paragraph" w:styleId="ListBullet2">

</xml_diff>

<commit_message>
Refine design intent content and spacing
</commit_message>
<xml_diff>
--- a/docs/MEGABALL_DESIGN_INTENT.docx
+++ b/docs/MEGABALL_DESIGN_INTENT.docx
@@ -4,17 +4,15 @@
   <w:body>
     <w:p>
       <w:pPr>
-        <w:pStyle w:val="Title"/>
-        <w:keepNext/>
-        <w:spacing w:after="320"/>
-        <w:jc w:val="left"/>
+        <w:spacing w:after="240"/>
+        <w:jc w:val="center"/>
       </w:pPr>
       <w:r>
         <w:rPr>
           <w:rFonts w:ascii="Arial" w:hAnsi="Arial"/>
           <w:b/>
           <w:color w:val="000000"/>
-          <w:sz w:val="44"/>
+          <w:sz w:val="42"/>
         </w:rPr>
         <w:t>Design-Intent Document</w:t>
       </w:r>
@@ -22,467 +20,233 @@
     <w:p>
       <w:pPr>
         <w:pStyle w:val="Heading1"/>
-        <w:keepNext/>
-        <w:pageBreakBefore w:val="0"/>
-        <w:spacing w:before="180" w:after="80"/>
       </w:pPr>
       <w:r>
-        <w:rPr>
-          <w:rFonts w:ascii="Arial" w:hAnsi="Arial"/>
-          <w:b/>
-          <w:color w:val="000000"/>
-          <w:sz w:val="30"/>
-        </w:rPr>
         <w:t>1. Game title and genre</w:t>
       </w:r>
     </w:p>
     <w:p>
       <w:pPr>
-        <w:keepLines/>
-        <w:widowControl/>
+        <w:spacing w:before="0" w:after="140" w:line="259" w:lineRule="auto"/>
       </w:pPr>
       <w:r>
-        <w:rPr>
-          <w:rFonts w:ascii="Arial" w:hAnsi="Arial"/>
-          <w:b w:val="0"/>
-          <w:color w:val="000000"/>
-          <w:sz w:val="22"/>
-        </w:rPr>
-        <w:t>MegaBall Defense - Tower Defense and Strategy</w:t>
+        <w:t>MEGABALL - Tower Defense and Strategy</w:t>
       </w:r>
     </w:p>
     <w:p>
       <w:pPr>
         <w:pStyle w:val="Heading1"/>
-        <w:keepNext/>
-        <w:pageBreakBefore w:val="0"/>
-        <w:spacing w:before="180" w:after="80"/>
       </w:pPr>
       <w:r>
-        <w:rPr>
-          <w:rFonts w:ascii="Arial" w:hAnsi="Arial"/>
-          <w:b/>
-          <w:color w:val="000000"/>
-          <w:sz w:val="30"/>
-        </w:rPr>
         <w:t>2. Target player and pitch</w:t>
       </w:r>
     </w:p>
     <w:p>
       <w:pPr>
-        <w:keepLines/>
-        <w:widowControl/>
+        <w:spacing w:before="0" w:after="140" w:line="259" w:lineRule="auto"/>
       </w:pPr>
       <w:r>
-        <w:rPr>
-          <w:rFonts w:ascii="Arial" w:hAnsi="Arial"/>
-          <w:b w:val="0"/>
-          <w:color w:val="000000"/>
-          <w:sz w:val="22"/>
-        </w:rPr>
-        <w:t>MegaBall Defense is for players who enjoy strategy, tower defense, resource management, pinball, and fast-paced action.</w:t>
-      </w:r>
-    </w:p>
-    <w:p>
-      <w:pPr>
-        <w:keepLines/>
-        <w:widowControl/>
-      </w:pPr>
-      <w:r>
-        <w:rPr>
-          <w:rFonts w:ascii="Arial" w:hAnsi="Arial"/>
-          <w:b w:val="0"/>
-          <w:color w:val="000000"/>
-          <w:sz w:val="22"/>
-        </w:rPr>
-        <w:t>It is a tower-defense game with pinball as its twist: players position defenses to redirect rapidly falling enemy balls, make them collide, and stop them reaching the drain. Energy management, cards, and power-ups help players turn difficult waves in their favour.</w:t>
+        <w:t>MEGABALL is a tower-defense game with pinball as its twist: players position defenses to redirect falling enemy balls, make them collide, and stop them reaching the drain. It is for players who enjoy strategic placement, resource management, and fast-paced arcade action. Cards and power-ups help turn difficult waves in their favour.</w:t>
       </w:r>
     </w:p>
     <w:p>
       <w:pPr>
         <w:pStyle w:val="Heading1"/>
-        <w:keepNext/>
-        <w:pageBreakBefore w:val="0"/>
-        <w:spacing w:before="180" w:after="80"/>
       </w:pPr>
       <w:r>
-        <w:rPr>
-          <w:rFonts w:ascii="Arial" w:hAnsi="Arial"/>
-          <w:b/>
-          <w:color w:val="000000"/>
-          <w:sz w:val="30"/>
-        </w:rPr>
         <w:t>3. How to play (controls)</w:t>
       </w:r>
     </w:p>
     <w:p>
       <w:pPr>
-        <w:pStyle w:val="ListBullet"/>
-        <w:keepLines/>
-        <w:widowControl/>
+        <w:spacing w:before="0" w:after="140" w:line="259" w:lineRule="auto"/>
       </w:pPr>
       <w:r>
-        <w:rPr>
-          <w:rFonts w:ascii="Arial" w:hAnsi="Arial"/>
-          <w:b w:val="0"/>
-          <w:color w:val="000000"/>
-          <w:sz w:val="21"/>
-        </w:rPr>
         <w:t>Select Play and choose a level. The opening tutorial explains the controls.</w:t>
       </w:r>
     </w:p>
     <w:p>
       <w:pPr>
-        <w:pStyle w:val="ListBullet"/>
-        <w:keepLines/>
-        <w:widowControl/>
+        <w:spacing w:before="0" w:after="140" w:line="259" w:lineRule="auto"/>
       </w:pPr>
       <w:r>
-        <w:rPr>
-          <w:rFonts w:ascii="Arial" w:hAnsi="Arial"/>
-          <w:b w:val="0"/>
-          <w:color w:val="000000"/>
-          <w:sz w:val="21"/>
-        </w:rPr>
         <w:t>Hold either half of the playfield to operate the matching bottom flipper and knock balls away from the drain. These manual flippers do not deal damage.</w:t>
       </w:r>
     </w:p>
     <w:p>
       <w:pPr>
-        <w:pStyle w:val="ListBullet"/>
-        <w:keepLines/>
-        <w:widowControl/>
+        <w:spacing w:before="0" w:after="140" w:line="259" w:lineRule="auto"/>
       </w:pPr>
       <w:r>
-        <w:rPr>
-          <w:rFonts w:ascii="Arial" w:hAnsi="Arial"/>
-          <w:b w:val="0"/>
-          <w:color w:val="000000"/>
-          <w:sz w:val="21"/>
-        </w:rPr>
         <w:t>Spend Energy on automatic Paddles or Bumpers using the build controls beside the cards, then place them in open slots. These defenses damage and redirect balls automatically and can be upgraded between waves.</w:t>
       </w:r>
     </w:p>
     <w:p>
       <w:pPr>
-        <w:pStyle w:val="ListBullet"/>
-        <w:keepLines/>
-        <w:widowControl/>
+        <w:spacing w:before="0" w:after="80" w:line="259" w:lineRule="auto"/>
       </w:pPr>
       <w:r>
-        <w:rPr>
-          <w:rFonts w:ascii="Arial" w:hAnsi="Arial"/>
-          <w:b w:val="0"/>
-          <w:color w:val="000000"/>
-          <w:sz w:val="21"/>
-        </w:rPr>
         <w:t>Tap a card to use its power.</w:t>
       </w:r>
     </w:p>
     <w:p>
       <w:pPr>
         <w:pStyle w:val="Heading1"/>
-        <w:keepNext/>
-        <w:pageBreakBefore w:val="0"/>
-        <w:spacing w:before="180" w:after="80"/>
       </w:pPr>
       <w:r>
-        <w:rPr>
-          <w:rFonts w:ascii="Arial" w:hAnsi="Arial"/>
-          <w:b/>
-          <w:color w:val="000000"/>
-          <w:sz w:val="30"/>
-        </w:rPr>
         <w:t>4. Core loop</w:t>
       </w:r>
     </w:p>
     <w:p>
       <w:pPr>
-        <w:keepLines/>
-        <w:widowControl/>
+        <w:spacing w:before="0" w:after="140" w:line="259" w:lineRule="auto"/>
       </w:pPr>
       <w:r>
-        <w:rPr>
-          <w:rFonts w:ascii="Arial" w:hAnsi="Arial"/>
-          <w:b w:val="0"/>
-          <w:color w:val="000000"/>
-          <w:sz w:val="22"/>
-        </w:rPr>
         <w:t>Enemy balls fall towards the drain in increasingly difficult waves. Place Paddles and Bumpers to damage and redirect them, using the manual flippers to save escaping balls.</w:t>
       </w:r>
     </w:p>
     <w:p>
       <w:pPr>
-        <w:keepLines/>
-        <w:widowControl/>
+        <w:spacing w:before="0" w:after="140" w:line="259" w:lineRule="auto"/>
       </w:pPr>
       <w:r>
-        <w:rPr>
-          <w:rFonts w:ascii="Arial" w:hAnsi="Arial"/>
-          <w:b w:val="0"/>
-          <w:color w:val="000000"/>
-          <w:sz w:val="22"/>
-        </w:rPr>
         <w:t>Destroyed enemies provide Energy for new defenses, upgrades, and repairs. Enemies become stronger and can damage defenses, so the player must improve and repair the board to keep up.</w:t>
       </w:r>
     </w:p>
     <w:p>
       <w:pPr>
-        <w:keepLines/>
-        <w:widowControl/>
+        <w:spacing w:before="0" w:after="60" w:line="259" w:lineRule="auto"/>
       </w:pPr>
       <w:r>
-        <w:rPr>
-          <w:rFonts w:ascii="Arial" w:hAnsi="Arial"/>
-          <w:b w:val="0"/>
-          <w:color w:val="000000"/>
-          <w:sz w:val="22"/>
-        </w:rPr>
         <w:t>Clear every ball to win; let too many reach the drain and the level ends.</w:t>
       </w:r>
     </w:p>
     <w:p>
       <w:pPr>
         <w:pStyle w:val="Heading1"/>
-        <w:keepNext/>
         <w:pageBreakBefore/>
-        <w:spacing w:before="180" w:after="80"/>
       </w:pPr>
       <w:r>
-        <w:rPr>
-          <w:rFonts w:ascii="Arial" w:hAnsi="Arial"/>
-          <w:b/>
-          <w:color w:val="000000"/>
-          <w:sz w:val="30"/>
-        </w:rPr>
         <w:t>5. What is in this prototype</w:t>
       </w:r>
     </w:p>
     <w:p>
       <w:pPr>
-        <w:pStyle w:val="ListBullet"/>
-        <w:keepLines/>
-        <w:widowControl/>
+        <w:spacing w:before="0" w:after="140" w:line="259" w:lineRule="auto"/>
       </w:pPr>
       <w:r>
-        <w:rPr>
-          <w:rFonts w:ascii="Arial" w:hAnsi="Arial"/>
-          <w:b w:val="0"/>
-          <w:color w:val="000000"/>
-          <w:sz w:val="21"/>
-        </w:rPr>
-        <w:t>The prototype contains five playable levels with distinct boards, waves, challenges, and bosses. It includes several enemy types, automatic Paddles and Bumpers with branching upgrades, power-up cards, an Energy economy, and complete win and loss states.</w:t>
+        <w:t>The prototype contains five levels and an Endless Mode, with six enemy types and seven distinct bosses that challenge different defensive setups. Players can build automatic Paddles and Bumpers, choose branching upgrades - Paddle to Frost or Power, Bumper to Blast, Shock or Launch - and use eleven cards.</w:t>
       </w:r>
     </w:p>
     <w:p>
       <w:pPr>
-        <w:pStyle w:val="ListBullet"/>
-        <w:keepLines/>
-        <w:widowControl/>
+        <w:spacing w:before="0" w:after="140" w:line="259" w:lineRule="auto"/>
       </w:pPr>
       <w:r>
-        <w:rPr>
-          <w:rFonts w:ascii="Arial" w:hAnsi="Arial"/>
-          <w:b w:val="0"/>
-          <w:color w:val="000000"/>
-          <w:sz w:val="21"/>
-        </w:rPr>
-        <w:t>An interactive tutorial, level selection, card loadout, star ratings, unlockable cards and slots, pause, restart, and Endless Mode are included. Endless Mode creates increasingly difficult waves and records the player's best run.</w:t>
+        <w:t>It also includes an Energy economy, interactive tutorial, card loadout, star ratings, star-gated card and slot unlocks, pause and restart options, and complete win and loss states. Endless Mode creates increasingly difficult waves and records the player's best run.</w:t>
       </w:r>
     </w:p>
     <w:p>
       <w:pPr>
-        <w:pStyle w:val="ListBullet"/>
-        <w:keepLines/>
-        <w:widowControl/>
+        <w:spacing w:before="0" w:after="140" w:line="259" w:lineRule="auto"/>
       </w:pPr>
       <w:r>
-        <w:rPr>
-          <w:rFonts w:ascii="Arial" w:hAnsi="Arial"/>
-          <w:b w:val="0"/>
-          <w:color w:val="000000"/>
-          <w:sz w:val="21"/>
-        </w:rPr>
         <w:t>The current build covers one world. Additional worlds are not included.</w:t>
       </w:r>
     </w:p>
     <w:p>
       <w:pPr>
         <w:pStyle w:val="Heading1"/>
-        <w:keepNext/>
-        <w:pageBreakBefore w:val="0"/>
-        <w:spacing w:before="180" w:after="80"/>
       </w:pPr>
       <w:r>
-        <w:rPr>
-          <w:rFonts w:ascii="Arial" w:hAnsi="Arial"/>
-          <w:b/>
-          <w:color w:val="000000"/>
-          <w:sz w:val="30"/>
-        </w:rPr>
         <w:t>6. Progression and signature twist</w:t>
       </w:r>
     </w:p>
     <w:p>
       <w:pPr>
-        <w:keepLines/>
-        <w:widowControl/>
+        <w:spacing w:before="0" w:after="140" w:line="259" w:lineRule="auto"/>
       </w:pPr>
       <w:r>
-        <w:rPr>
-          <w:rFonts w:ascii="Arial" w:hAnsi="Arial"/>
-          <w:b w:val="0"/>
-          <w:color w:val="000000"/>
-          <w:sz w:val="22"/>
-        </w:rPr>
-        <w:t>The signature twist is the crossover between pinball and tower defense. Players use physics to redirect enemy balls while building defenses that control each wave.</w:t>
-      </w:r>
-    </w:p>
-    <w:p>
-      <w:pPr>
-        <w:keepLines/>
-        <w:widowControl/>
-      </w:pPr>
-      <w:r>
-        <w:rPr>
-          <w:rFonts w:ascii="Arial" w:hAnsi="Arial"/>
-          <w:b w:val="0"/>
-          <w:color w:val="000000"/>
-          <w:sz w:val="22"/>
-        </w:rPr>
         <w:t>One of my favourite mechanics is the Mega Ball. The Power Paddle and Mega Ball card turn an enemy ball into a weapon that destroys other balls on contact, creating chain reactions with satisfying visual and sound feedback.</w:t>
       </w:r>
     </w:p>
     <w:p>
       <w:pPr>
-        <w:keepLines/>
-        <w:widowControl/>
+        <w:spacing w:before="0" w:after="140" w:line="259" w:lineRule="auto"/>
       </w:pPr>
       <w:r>
-        <w:rPr>
-          <w:rFonts w:ascii="Arial" w:hAnsi="Arial"/>
-          <w:b w:val="0"/>
-          <w:color w:val="000000"/>
-          <w:sz w:val="22"/>
-        </w:rPr>
-        <w:t>Waves become faster and tougher as new enemies and bosses appear and the player's board grows stronger.</w:t>
+        <w:t>As waves become faster and tougher, new enemies and bosses appear. Choosing when and where to create a Mega Ball becomes an important way to regain control.</w:t>
       </w:r>
     </w:p>
     <w:p>
       <w:pPr>
         <w:pStyle w:val="Heading1"/>
-        <w:keepNext/>
-        <w:pageBreakBefore w:val="0"/>
-        <w:spacing w:before="180" w:after="80"/>
       </w:pPr>
       <w:r>
-        <w:rPr>
-          <w:rFonts w:ascii="Arial" w:hAnsi="Arial"/>
-          <w:b/>
-          <w:color w:val="000000"/>
-          <w:sz w:val="30"/>
-        </w:rPr>
         <w:t>7. Future-state vision</w:t>
       </w:r>
     </w:p>
     <w:p>
       <w:pPr>
-        <w:keepLines/>
-        <w:widowControl/>
+        <w:spacing w:before="0" w:after="80" w:line="259" w:lineRule="auto"/>
       </w:pPr>
       <w:r>
-        <w:rPr>
-          <w:rFonts w:ascii="Arial" w:hAnsi="Arial"/>
-          <w:b w:val="0"/>
-          <w:color w:val="000000"/>
-          <w:sz w:val="22"/>
-        </w:rPr>
         <w:t>The full version would add:</w:t>
       </w:r>
     </w:p>
     <w:p>
       <w:pPr>
         <w:pStyle w:val="ListBullet"/>
-        <w:keepLines/>
-        <w:widowControl/>
+        <w:spacing w:after="80" w:line="247" w:lineRule="auto"/>
+        <w:ind w:left="403" w:hanging="230"/>
       </w:pPr>
       <w:r>
-        <w:rPr>
-          <w:rFonts w:ascii="Arial" w:hAnsi="Arial"/>
-          <w:b w:val="0"/>
-          <w:color w:val="000000"/>
-          <w:sz w:val="21"/>
-        </w:rPr>
         <w:t>A larger playfield with additional player-controlled side paddles.</w:t>
       </w:r>
     </w:p>
     <w:p>
       <w:pPr>
         <w:pStyle w:val="ListBullet"/>
-        <w:keepLines/>
-        <w:widowControl/>
+        <w:spacing w:after="80" w:line="247" w:lineRule="auto"/>
+        <w:ind w:left="403" w:hanging="230"/>
       </w:pPr>
       <w:r>
-        <w:rPr>
-          <w:rFonts w:ascii="Arial" w:hAnsi="Arial"/>
-          <w:b w:val="0"/>
-          <w:color w:val="000000"/>
-          <w:sz w:val="21"/>
-        </w:rPr>
         <w:t>Tiered Freeze I, II, and III, Power Paddle I, II, and III, and Mega Ball I, II, and III upgrades.</w:t>
       </w:r>
     </w:p>
     <w:p>
       <w:pPr>
         <w:pStyle w:val="ListBullet"/>
-        <w:keepLines/>
-        <w:widowControl/>
+        <w:spacing w:after="80" w:line="247" w:lineRule="auto"/>
+        <w:ind w:left="403" w:hanging="230"/>
       </w:pPr>
       <w:r>
-        <w:rPr>
-          <w:rFonts w:ascii="Arial" w:hAnsi="Arial"/>
-          <w:b w:val="0"/>
-          <w:color w:val="000000"/>
-          <w:sz w:val="21"/>
-        </w:rPr>
         <w:t>Merging two Level I Bumpers into a tougher Level II Bumper while repairing damage, with later Level III merges.</w:t>
       </w:r>
     </w:p>
     <w:p>
       <w:pPr>
         <w:pStyle w:val="ListBullet"/>
-        <w:keepLines/>
-        <w:widowControl/>
+        <w:spacing w:after="80" w:line="247" w:lineRule="auto"/>
+        <w:ind w:left="403" w:hanging="230"/>
       </w:pPr>
       <w:r>
-        <w:rPr>
-          <w:rFonts w:ascii="Arial" w:hAnsi="Arial"/>
-          <w:b w:val="0"/>
-          <w:color w:val="000000"/>
-          <w:sz w:val="21"/>
-        </w:rPr>
         <w:t>Defense fusions, more worlds, world-specific cards and boosters, and bosses with different weaknesses.</w:t>
       </w:r>
     </w:p>
     <w:p>
       <w:pPr>
         <w:pStyle w:val="ListBullet"/>
-        <w:keepLines/>
-        <w:widowControl/>
+        <w:spacing w:after="80" w:line="247" w:lineRule="auto"/>
+        <w:ind w:left="403" w:hanging="230"/>
       </w:pPr>
       <w:r>
-        <w:rPr>
-          <w:rFonts w:ascii="Arial" w:hAnsi="Arial"/>
-          <w:b w:val="0"/>
-          <w:color w:val="000000"/>
-          <w:sz w:val="21"/>
-        </w:rPr>
         <w:t>Haptics, more sound effects, stronger impact feedback, random wave events, random card choices, and deeper Endless Mode progression.</w:t>
       </w:r>
     </w:p>
     <w:sectPr>
       <w:pgSz w:w="12240" w:h="15840"/>
-      <w:pgMar w:top="1123" w:right="1368" w:bottom="1123" w:left="1368" w:header="720" w:footer="720" w:gutter="0"/>
+      <w:pgMar w:top="792" w:right="1037" w:bottom="792" w:left="1037" w:header="720" w:footer="720" w:gutter="0"/>
       <w:cols w:space="720"/>
       <w:docGrid w:linePitch="360"/>
     </w:sectPr>
@@ -854,13 +618,12 @@
     <w:qFormat/>
     <w:rsid w:val="00FC693F"/>
     <w:pPr>
-      <w:spacing w:after="120" w:line="259" w:lineRule="auto"/>
+      <w:spacing w:after="140" w:line="259" w:lineRule="auto"/>
     </w:pPr>
     <w:rPr>
       <w:rFonts w:ascii="Arial" w:hAnsi="Arial"/>
-      <w:b w:val="0"/>
-      <w:color w:val="000000"/>
-      <w:sz w:val="22"/>
+      <w:color w:val="14181F"/>
+      <w:sz w:val="21"/>
     </w:rPr>
   </w:style>
   <w:style w:type="paragraph" w:styleId="Header">
@@ -918,15 +681,15 @@
     <w:pPr>
       <w:keepNext/>
       <w:keepLines/>
-      <w:spacing w:before="480" w:after="0"/>
+      <w:spacing w:before="220" w:after="160"/>
       <w:outlineLvl w:val="0"/>
     </w:pPr>
     <w:rPr>
       <w:rFonts w:asciiTheme="majorHAnsi" w:eastAsiaTheme="majorEastAsia" w:hAnsiTheme="majorHAnsi" w:cstheme="majorBidi" w:ascii="Arial" w:hAnsi="Arial"/>
       <w:b/>
       <w:bCs/>
-      <w:color w:val="000000"/>
-      <w:sz w:val="30"/>
+      <w:color w:val="14181F"/>
+      <w:sz w:val="28"/>
       <w:szCs w:val="28"/>
     </w:rPr>
   </w:style>
@@ -1204,16 +967,18 @@
     <w:qFormat/>
     <w:rsid w:val="00FC693F"/>
     <w:pPr>
+      <w:pBdr>
+        <w:bottom w:val="single" w:sz="8" w:space="4" w:color="4F81BD" w:themeColor="accent1"/>
+      </w:pBdr>
       <w:spacing w:after="300" w:line="240" w:lineRule="auto"/>
       <w:contextualSpacing/>
     </w:pPr>
     <w:rPr>
-      <w:rFonts w:asciiTheme="majorHAnsi" w:eastAsiaTheme="majorEastAsia" w:hAnsiTheme="majorHAnsi" w:cstheme="majorBidi" w:ascii="Arial" w:hAnsi="Arial"/>
-      <w:b/>
-      <w:color w:val="000000"/>
+      <w:rFonts w:asciiTheme="majorHAnsi" w:eastAsiaTheme="majorEastAsia" w:hAnsiTheme="majorHAnsi" w:cstheme="majorBidi"/>
+      <w:color w:val="17365D" w:themeColor="text2" w:themeShade="BF"/>
       <w:spacing w:val="5"/>
       <w:kern w:val="28"/>
-      <w:sz w:val="44"/>
+      <w:sz w:val="52"/>
       <w:szCs w:val="52"/>
     </w:rPr>
   </w:style>
@@ -1387,15 +1152,12 @@
       <w:numPr>
         <w:numId w:val="1"/>
       </w:numPr>
-      <w:spacing w:after="80" w:line="254" w:lineRule="auto"/>
-      <w:ind w:left="403" w:hanging="230"/>
       <w:contextualSpacing/>
     </w:pPr>
     <w:rPr>
       <w:rFonts w:ascii="Arial" w:hAnsi="Arial"/>
-      <w:b w:val="0"/>
-      <w:color w:val="000000"/>
-      <w:sz w:val="21"/>
+      <w:color w:val="14181F"/>
+      <w:sz w:val="20"/>
     </w:rPr>
   </w:style>
   <w:style w:type="paragraph" w:styleId="ListBullet2">

</xml_diff>